<commit_message>
docs: note Andre v3 post-reunion (Cab=mocks, Ain2015=19, total 181, Buech=35, index hybride pilote taxons+pops)
</commit_message>
<xml_diff>
--- a/docs/note_reunion_andre.docx
+++ b/docs/note_reunion_andre.docx
@@ -7,7 +7,7 @@
         <w:pStyle w:val="Title"/>
       </w:pPr>
       <w:r>
-        <w:t>microbiome-hybrid — Note de réunion André</w:t>
+        <w:t>microbiome-hybrid — Note projet (post-réunion André)</w:t>
       </w:r>
     </w:p>
     <w:p>
@@ -16,7 +16,7 @@
           <w:b w:val="0"/>
           <w:i/>
         </w:rPr>
-        <w:t>Rappel de contexte + questions à trancher. État vérifié sur le cluster (juillet 2026).</w:t>
+        <w:t>Mise à jour 2026-07-27 après réunion. État vérifié sur le cluster.</w:t>
       </w:r>
     </w:p>
     <w:p>
@@ -33,16 +33,7 @@
           <w:b w:val="0"/>
           <w:i w:val="0"/>
         </w:rPr>
-        <w:t>Question : le microbiote (16S V4 ; nageoire, midgut, hindgut, branchie) des HYBRIDES entre le hotu Chondrostoma nasus (Cn) et le toxostome Parachondrostoma toxostoma (Pt) est-il INTERMÉDIAIRE entre les parentaux, ou TRANSGRESSIF (hors de la gamme parentale) ?</w:t>
-      </w:r>
-    </w:p>
-    <w:p>
-      <w:r>
-        <w:rPr>
-          <w:b w:val="0"/>
-          <w:i w:val="0"/>
-        </w:rPr>
-        <w:t>Les individus non encore déterminés (parentaux + hybrides) sont codés Ch (Chondrostoma sp.) en attendant l'identification d'André.</w:t>
+        <w:t>Question : le microbiote (16S V4 ; nageoire, midgut, hindgut, branchie) des HYBRIDES entre le hotu Chondrostoma nasus (Cn) et le toxostome Parachondrostoma toxostoma (Pt) est-il INTERMÉDIAIRE entre les parentaux, ou TRANSGRESSIF ? Individus non déterminés = code Ch.</w:t>
       </w:r>
     </w:p>
     <w:p>
@@ -58,7 +49,7 @@
         <w:pStyle w:val="ListBullet"/>
       </w:pPr>
       <w:r>
-        <w:t>4 tissus par poisson : nageoire caudale, midgut, hindgut, branchie (gradient de contact avec l'eau).</w:t>
+        <w:t>4 tissus par poisson : nageoire caudale, midgut, hindgut, branchie.</w:t>
       </w:r>
     </w:p>
     <w:p>
@@ -66,7 +57,7 @@
         <w:pStyle w:val="ListBullet"/>
       </w:pPr>
       <w:r>
-        <w:t>3 runs MiSeq = re-séquençage des mêmes librairies (triplicats techniques, gardés distincts pour l'effet run).</w:t>
+        <w:t>3 runs MiSeq = re-séquençage des mêmes librairies (triplicats techniques).</w:t>
       </w:r>
     </w:p>
     <w:p>
@@ -74,7 +65,7 @@
         <w:pStyle w:val="ListBullet"/>
       </w:pPr>
       <w:r>
-        <w:t>183 individus séquencés au total.</w:t>
+        <w:t>181 poissons biologiques (183 échantillons « poisson » séquencés − 2 mocks mal étiquetés, cf. §4).</w:t>
       </w:r>
     </w:p>
     <w:p>
@@ -82,7 +73,7 @@
         <w:pStyle w:val="Heading1"/>
       </w:pPr>
       <w:r>
-        <w:t>3. La « liste des 6 » — populations par rôle dans la zone hybride</w:t>
+        <w:t>3. La « liste des 6 » — populations par rôle</w:t>
       </w:r>
     </w:p>
     <w:p>
@@ -279,7 +270,7 @@
           </w:tcPr>
           <w:p>
             <w:r>
-              <w:t>35</w:t>
+              <w:t>33</w:t>
             </w:r>
           </w:p>
         </w:tc>
@@ -289,7 +280,7 @@
           </w:tcPr>
           <w:p>
             <w:r>
-              <w:t>Cn 4, Pt 10 (2014) · Ch 21 (2015)</w:t>
+              <w:t>Cn 4, Pt 10 (2014) · Ch 19 (2015)</w:t>
             </w:r>
           </w:p>
         </w:tc>
@@ -549,7 +540,7 @@
           <w:b w:val="0"/>
           <w:i/>
         </w:rPr>
-        <w:t>Piège Ain : « Ain » = deux codes dans les données — Ain (2014) + Cab (2015). Réunis = 35.</w:t>
+        <w:t>Ain = deux codes : Ain (2014, 14) + Cab (2015, 19 après exclusion des 2 mocks) = 33.</w:t>
       </w:r>
     </w:p>
     <w:p>
@@ -557,7 +548,39 @@
         <w:pStyle w:val="Heading1"/>
       </w:pPr>
       <w:r>
-        <w:t>4. QUESTIONS EN SUSPENS pour André</w:t>
+        <w:t>4. RÉSOLU en réunion (2026-07-27)</w:t>
+      </w:r>
+    </w:p>
+    <w:p>
+      <w:pPr>
+        <w:pStyle w:val="ListBullet"/>
+      </w:pPr>
+      <w:r>
+        <w:t>Cab1021 et Cab1022 = MOCKS confirmés (mal étiquetés, plaque 1, index série 711). Étiquetés et interprétés comme mocks. Ain 2015 : 21 → 19 poissons ; total 183 → 181.</w:t>
+      </w:r>
+    </w:p>
+    <w:p>
+      <w:pPr>
+        <w:pStyle w:val="ListBullet"/>
+      </w:pPr>
+      <w:r>
+        <w:t>Büech = 35 poissons, définitif. Le « 53 » évoqué avant était une lecture erronée — retiré partout.</w:t>
+      </w:r>
+    </w:p>
+    <w:p>
+      <w:pPr>
+        <w:pStyle w:val="ListBullet"/>
+      </w:pPr>
+      <w:r>
+        <w:t>Contamination de puits (9 individus : Bue1005/1001/1004/1011, Ain1043, Caa1018, Per2011, Avi1001, + branchie de Man1022) : confirmée. Stratégie = retirer les ASV mock contaminants, garder les ASV légitimes du poisson (puis re-seuillage à 3 000).</w:t>
+      </w:r>
+    </w:p>
+    <w:p>
+      <w:pPr>
+        <w:pStyle w:val="Heading1"/>
+      </w:pPr>
+      <w:r>
+        <w:t>5. EN ATTENTE — génotypage / index hybride (André)</w:t>
       </w:r>
     </w:p>
     <w:p>
@@ -566,7 +589,7 @@
           <w:b/>
           <w:i w:val="0"/>
         </w:rPr>
-        <w:t>A. Identification des poissons (verrou principal)</w:t>
+        <w:t>Le génotypage des poissons n'est pas terminé. Il produira un INDEX HYBRIDE par individu, qui pilotera :</w:t>
       </w:r>
     </w:p>
     <w:p>
@@ -574,16 +597,7 @@
         <w:pStyle w:val="ListBullet"/>
       </w:pPr>
       <w:r>
-        <w:t>Résolution des Ch : quels individus sont hotu (Cn), toxostome (Pt), ou HYBRIDE (Hy) ? Sans cela, la question hybride (intermédiaire vs transgressif) ne peut pas être testée.</w:t>
-      </w:r>
-    </w:p>
-    <w:p>
-      <w:r>
-        <w:rPr>
-          <w:b/>
-          <w:i w:val="0"/>
-        </w:rPr>
-        <w:t>B. Rattachement code-site → population</w:t>
+        <w:t>la résolution des Ch en hotu / toxostome / hybride (question scientifique centrale) ;</w:t>
       </w:r>
     </w:p>
     <w:p>
@@ -591,48 +605,7 @@
         <w:pStyle w:val="ListBullet"/>
       </w:pPr>
       <w:r>
-        <w:t>Manosque (Man) — 15 poissons (Durance, 2014). Nom confirmé mais ABSENT du tableau des 6. 7e population ou exclusion ?</w:t>
-      </w:r>
-    </w:p>
-    <w:p>
-      <w:pPr>
-        <w:pStyle w:val="ListBullet"/>
-      </w:pPr>
-      <w:r>
-        <w:t>Per — 10 poissons. Ni nom ni rôle connus. Quel site, quel rôle dans le gradient ?</w:t>
-      </w:r>
-    </w:p>
-    <w:p>
-      <w:pPr>
-        <w:pStyle w:val="ListBullet"/>
-      </w:pPr>
-      <w:r>
-        <w:t>Büech (Bue) — écart d'effectif : 35 séquencés vs 53 dans le tableau. D'où vient la différence (non séquencés, autre année, codes fusionnés) ?</w:t>
-      </w:r>
-    </w:p>
-    <w:p>
-      <w:r>
-        <w:rPr>
-          <w:b/>
-          <w:i w:val="0"/>
-        </w:rPr>
-        <w:t>C. Échantillons suspects révélés par l'analyse des mocks (nouveau)</w:t>
-      </w:r>
-    </w:p>
-    <w:p>
-      <w:pPr>
-        <w:pStyle w:val="ListBullet"/>
-      </w:pPr>
-      <w:r>
-        <w:t>Cab1021 et Cab1022 (Ain 2015) : très probablement des PUITS MOCK mal étiquetés — un seul tissu (caudale), 70-99 % de lectures Zymo, en puits G11/H11 série d'index 711 (position des vrais mocks). Confirmer : étaient-ce des puits mock sur la plaque 1 ? -&gt; si oui, Ain 2015 passe de 21 à 19 poissons.</w:t>
-      </w:r>
-    </w:p>
-    <w:p>
-      <w:pPr>
-        <w:pStyle w:val="ListBullet"/>
-      </w:pPr>
-      <w:r>
-        <w:t>Contamination de puits (9 individus : Bue1005/1001/1004/1011, Ain1043, Caa1018, Per2011, Avi1001, + branchie de Man1022) : vrais poissons dont un puits a reçu du mock (20-65 %). Origine ? Débordement de puits sur la plaque ?</w:t>
+        <w:t>le choix des populations conservées dans l'analyse finale — notamment le sort de Manosque (Man, 15 poissons, hors liste des 6) et de Per (10 poissons, nom+rôle inconnus).</w:t>
       </w:r>
     </w:p>
     <w:p>
@@ -640,7 +613,7 @@
         <w:pStyle w:val="Heading1"/>
       </w:pPr>
       <w:r>
-        <w:t>5. Déjà fait et figé (n'attend pas André)</w:t>
+        <w:t>6. Déjà fait et figé (n'attend pas André)</w:t>
       </w:r>
     </w:p>
     <w:p>
@@ -649,16 +622,7 @@
           <w:b w:val="0"/>
           <w:i w:val="0"/>
         </w:rPr>
-        <w:t>Validation mock (8/8 taxons) · décontamination (decontam, seuil 0,1) · arbre phylogénétique (MAFFT+FastTree2, 44 256 ASV) · QC profondeur · seuil de raréfaction fixé à 3 000 lectures · crosstalk négligeable (0,0002 %) · stratégie de traitement des mocks. Tout est documenté dans docs/.</w:t>
-      </w:r>
-    </w:p>
-    <w:p>
-      <w:r>
-        <w:rPr>
-          <w:b w:val="0"/>
-          <w:i/>
-        </w:rPr>
-        <w:t>Bloqué sur André : contrastes par taxon et le long du gradient, question hybride, et §1 du Materials &amp; Methods (à figer d'un coup une fois les identifications reçues).</w:t>
+        <w:t>Validation mock (8/8) · décontamination (decontam 0,1) · arbre phylogénétique (MAFFT+FastTree2, 44 256 ASV) · QC profondeur · seuil de raréfaction = 3 000 lectures · crosstalk négligeable (0,0002 %) · stratégie mocks (exclusion des 2 Cab + retrait ASV sur puits contaminés). Tout documenté dans docs/.</w:t>
       </w:r>
     </w:p>
     <w:sectPr>

</xml_diff>